<commit_message>
feat: expand to 18 medical specialities and all 24 doctors with clinical symptoms and updated docs
</commit_message>
<xml_diff>
--- a/Software_Requirements_Specification_SRS.docx
+++ b/Software_Requirements_Specification_SRS.docx
@@ -70,7 +70,7 @@
           <w:sz w:val="22"/>
           <w:szCs w:val="22"/>
         </w:rPr>
-        <w:t xml:space="preserve">This Software Requirements Specification (SRS) defines the functional, non-functional, interface, and behavioral requirements for the Smart Doctor Appointment &amp; Clinical Guidance System. The project is developed for the ICT Academy of Kerala Full Stack Application Development program.</w:t>
+        <w:t xml:space="preserve">This Software Requirements Specification (SRS) defines the functional, non-functional, interface, and behavioral requirements for the Smart Doctor Appointment &amp; Clinical Guidance System. Developed for the ICT Academy of Kerala Full Stack Application Development program.</w:t>
       </w:r>
     </w:p>
     <w:p>
@@ -98,7 +98,7 @@
           <w:sz w:val="22"/>
           <w:szCs w:val="22"/>
         </w:rPr>
-        <w:t xml:space="preserve">Mandatory functional components and architectural layers.</w:t>
+        <w:t xml:space="preserve">Mandatory functional components, medical specialties, and architectural layers.</w:t>
       </w:r>
     </w:p>
     <w:p>
@@ -154,7 +154,7 @@
           <w:sz w:val="22"/>
           <w:szCs w:val="22"/>
         </w:rPr>
-        <w:t xml:space="preserve">Delivers an integrated MERN stack portal featuring automated symptom triage, real-time doctor availability scheduling, and role-based portals for Patients, Doctors, and Administrators.</w:t>
+        <w:t xml:space="preserve">Delivers an integrated MERN stack portal featuring automated symptom triage, real-time doctor availability scheduling across 18 medical departments with 24 verified specialists, and role-based portals for Patients, Doctors, and Administrators.</w:t>
       </w:r>
     </w:p>
     <w:p>
@@ -163,7 +163,7 @@
         <w:spacing w:after="120" w:before="240"/>
       </w:pPr>
       <w:r>
-        <w:t xml:space="preserve">2. Overall Description &amp; User Classes</w:t>
+        <w:t xml:space="preserve">2. Clinical Specializations &amp; Practitioner Scope</w:t>
       </w:r>
     </w:p>
     <w:p>
@@ -176,7 +176,7 @@
           <w:sz w:val="22"/>
           <w:szCs w:val="22"/>
         </w:rPr>
-        <w:t xml:space="preserve">The system utilizes a modern 3-tier MERN architecture: a React 18 single-page application communicating via a stateless RESTful JSON API with Node.js/Express, persisting documents in MongoDB.</w:t>
+        <w:t xml:space="preserve">The system features comprehensive outpatient coverage spanning 18 medical and surgical departments:</w:t>
       </w:r>
     </w:p>
     <w:p>
@@ -196,15 +196,15 @@
           <w:sz w:val="22"/>
           <w:szCs w:val="22"/>
         </w:rPr>
-        <w:t xml:space="preserve">Patient Role: </w:t>
-      </w:r>
-      <w:r>
-        <w:rPr>
-          <w:rFonts w:ascii="Calibri" w:cs="Calibri" w:eastAsia="Calibri" w:hAnsi="Calibri"/>
-          <w:sz w:val="22"/>
-          <w:szCs w:val="22"/>
-        </w:rPr>
-        <w:t xml:space="preserve">Can self-register, check symptoms with automated triage urgency levels, search specialists, book 30-minute consultation slots, and review doctor notes and prescriptions.</w:t>
+        <w:t xml:space="preserve">Core Clinical: </w:t>
+      </w:r>
+      <w:r>
+        <w:rPr>
+          <w:rFonts w:ascii="Calibri" w:cs="Calibri" w:eastAsia="Calibri" w:hAnsi="Calibri"/>
+          <w:sz w:val="22"/>
+          <w:szCs w:val="22"/>
+        </w:rPr>
+        <w:t xml:space="preserve">Cardiology, Neurology, Dermatology, Pediatrics, Orthopedics, and General Medicine.</w:t>
       </w:r>
     </w:p>
     <w:p>
@@ -224,15 +224,15 @@
           <w:sz w:val="22"/>
           <w:szCs w:val="22"/>
         </w:rPr>
-        <w:t xml:space="preserve">Doctor Role: </w:t>
-      </w:r>
-      <w:r>
-        <w:rPr>
-          <w:rFonts w:ascii="Calibri" w:cs="Calibri" w:eastAsia="Calibri" w:hAnsi="Calibri"/>
-          <w:sz w:val="22"/>
-          <w:szCs w:val="22"/>
-        </w:rPr>
-        <w:t xml:space="preserve">Manages upcoming appointments, accepts or cancels consultations, adds availability slots, and enters clinical notes with electronic prescriptions.</w:t>
+        <w:t xml:space="preserve">Specialized Clinical: </w:t>
+      </w:r>
+      <w:r>
+        <w:rPr>
+          <w:rFonts w:ascii="Calibri" w:cs="Calibri" w:eastAsia="Calibri" w:hAnsi="Calibri"/>
+          <w:sz w:val="22"/>
+          <w:szCs w:val="22"/>
+        </w:rPr>
+        <w:t xml:space="preserve">Psychiatry, Ophthalmology, ENT (Otolaryngology), Gastroenterology, and Pulmonology.</w:t>
       </w:r>
     </w:p>
     <w:p>
@@ -252,24 +252,15 @@
           <w:sz w:val="22"/>
           <w:szCs w:val="22"/>
         </w:rPr>
-        <w:t xml:space="preserve">Administrator Role: </w:t>
-      </w:r>
-      <w:r>
-        <w:rPr>
-          <w:rFonts w:ascii="Calibri" w:cs="Calibri" w:eastAsia="Calibri" w:hAnsi="Calibri"/>
-          <w:sz w:val="22"/>
-          <w:szCs w:val="22"/>
-        </w:rPr>
-        <w:t xml:space="preserve">Accesses hospital-wide KPIs, audits all consultations, registers new doctor profiles, and manages departments.</w:t>
-      </w:r>
-    </w:p>
-    <w:p>
-      <w:pPr>
-        <w:pStyle w:val="Heading1"/>
-        <w:spacing w:after="120" w:before="240"/>
-      </w:pPr>
-      <w:r>
-        <w:t xml:space="preserve">3. Functional Requirements</w:t>
+        <w:t xml:space="preserve">Tertiary Care: </w:t>
+      </w:r>
+      <w:r>
+        <w:rPr>
+          <w:rFonts w:ascii="Calibri" w:cs="Calibri" w:eastAsia="Calibri" w:hAnsi="Calibri"/>
+          <w:sz w:val="22"/>
+          <w:szCs w:val="22"/>
+        </w:rPr>
+        <w:t xml:space="preserve">Endocrinology &amp; Diabetology, Nephrology &amp; Urology, Gynecology &amp; Obstetrics, and Oncology.</w:t>
       </w:r>
     </w:p>
     <w:p>
@@ -289,15 +280,37 @@
           <w:sz w:val="22"/>
           <w:szCs w:val="22"/>
         </w:rPr>
-        <w:t xml:space="preserve">FR-01 (Authentication): </w:t>
-      </w:r>
-      <w:r>
-        <w:rPr>
-          <w:rFonts w:ascii="Calibri" w:cs="Calibri" w:eastAsia="Calibri" w:hAnsi="Calibri"/>
-          <w:sz w:val="22"/>
-          <w:szCs w:val="22"/>
-        </w:rPr>
-        <w:t xml:space="preserve">System shall authenticate users using JWT with bcrypt password salting.</w:t>
+        <w:t xml:space="preserve">Surgical &amp; Allied: </w:t>
+      </w:r>
+      <w:r>
+        <w:rPr>
+          <w:rFonts w:ascii="Calibri" w:cs="Calibri" w:eastAsia="Calibri" w:hAnsi="Calibri"/>
+          <w:sz w:val="22"/>
+          <w:szCs w:val="22"/>
+        </w:rPr>
+        <w:t xml:space="preserve">Rheumatology &amp; Immunology, General Surgery, and Dentistry &amp; Maxillofacial.</w:t>
+      </w:r>
+    </w:p>
+    <w:p>
+      <w:pPr>
+        <w:pStyle w:val="Heading1"/>
+        <w:spacing w:after="120" w:before="240"/>
+      </w:pPr>
+      <w:r>
+        <w:t xml:space="preserve">3. Overall Description &amp; User Classes</w:t>
+      </w:r>
+    </w:p>
+    <w:p>
+      <w:pPr>
+        <w:spacing w:after="100"/>
+      </w:pPr>
+      <w:r>
+        <w:rPr>
+          <w:rFonts w:ascii="Calibri" w:cs="Calibri" w:eastAsia="Calibri" w:hAnsi="Calibri"/>
+          <w:sz w:val="22"/>
+          <w:szCs w:val="22"/>
+        </w:rPr>
+        <w:t xml:space="preserve">The system utilizes a modern 3-tier MERN architecture: a React 18 single-page application communicating via a stateless RESTful JSON API with Node.js/Express, persisting documents in MongoDB.</w:t>
       </w:r>
     </w:p>
     <w:p>
@@ -317,15 +330,15 @@
           <w:sz w:val="22"/>
           <w:szCs w:val="22"/>
         </w:rPr>
-        <w:t xml:space="preserve">FR-02 (Authorization): </w:t>
-      </w:r>
-      <w:r>
-        <w:rPr>
-          <w:rFonts w:ascii="Calibri" w:cs="Calibri" w:eastAsia="Calibri" w:hAnsi="Calibri"/>
-          <w:sz w:val="22"/>
-          <w:szCs w:val="22"/>
-        </w:rPr>
-        <w:t xml:space="preserve">System shall enforce strict Role-Based Access Control (RBAC), returning 403 Forbidden for unauthorized endpoints.</w:t>
+        <w:t xml:space="preserve">Patient Role: </w:t>
+      </w:r>
+      <w:r>
+        <w:rPr>
+          <w:rFonts w:ascii="Calibri" w:cs="Calibri" w:eastAsia="Calibri" w:hAnsi="Calibri"/>
+          <w:sz w:val="22"/>
+          <w:szCs w:val="22"/>
+        </w:rPr>
+        <w:t xml:space="preserve">Can self-register, check symptoms with automated triage urgency levels, search specialists, book 30-minute consultation slots, and review doctor notes and prescriptions.</w:t>
       </w:r>
     </w:p>
     <w:p>
@@ -345,15 +358,15 @@
           <w:sz w:val="22"/>
           <w:szCs w:val="22"/>
         </w:rPr>
-        <w:t xml:space="preserve">FR-03 (Doctor Directory): </w:t>
-      </w:r>
-      <w:r>
-        <w:rPr>
-          <w:rFonts w:ascii="Calibri" w:cs="Calibri" w:eastAsia="Calibri" w:hAnsi="Calibri"/>
-          <w:sz w:val="22"/>
-          <w:szCs w:val="22"/>
-        </w:rPr>
-        <w:t xml:space="preserve">Patients can search and filter doctors by department, name, experience, and fee.</w:t>
+        <w:t xml:space="preserve">Doctor Role: </w:t>
+      </w:r>
+      <w:r>
+        <w:rPr>
+          <w:rFonts w:ascii="Calibri" w:cs="Calibri" w:eastAsia="Calibri" w:hAnsi="Calibri"/>
+          <w:sz w:val="22"/>
+          <w:szCs w:val="22"/>
+        </w:rPr>
+        <w:t xml:space="preserve">Manages upcoming appointments, accepts or cancels consultations, adds availability slots, and enters clinical notes with electronic prescriptions.</w:t>
       </w:r>
     </w:p>
     <w:p>
@@ -373,15 +386,24 @@
           <w:sz w:val="22"/>
           <w:szCs w:val="22"/>
         </w:rPr>
-        <w:t xml:space="preserve">FR-04 (Slot Booking): </w:t>
-      </w:r>
-      <w:r>
-        <w:rPr>
-          <w:rFonts w:ascii="Calibri" w:cs="Calibri" w:eastAsia="Calibri" w:hAnsi="Calibri"/>
-          <w:sz w:val="22"/>
-          <w:szCs w:val="22"/>
-        </w:rPr>
-        <w:t xml:space="preserve">Patients can book unreserved 30-minute consultation slots with atomic reservation checks to prevent double-booking.</w:t>
+        <w:t xml:space="preserve">Administrator Role: </w:t>
+      </w:r>
+      <w:r>
+        <w:rPr>
+          <w:rFonts w:ascii="Calibri" w:cs="Calibri" w:eastAsia="Calibri" w:hAnsi="Calibri"/>
+          <w:sz w:val="22"/>
+          <w:szCs w:val="22"/>
+        </w:rPr>
+        <w:t xml:space="preserve">Accesses hospital-wide KPIs, audits all consultations, registers new doctor profiles, and manages departments.</w:t>
+      </w:r>
+    </w:p>
+    <w:p>
+      <w:pPr>
+        <w:pStyle w:val="Heading1"/>
+        <w:spacing w:after="120" w:before="240"/>
+      </w:pPr>
+      <w:r>
+        <w:t xml:space="preserve">4. Functional Requirements</w:t>
       </w:r>
     </w:p>
     <w:p>
@@ -401,15 +423,15 @@
           <w:sz w:val="22"/>
           <w:szCs w:val="22"/>
         </w:rPr>
-        <w:t xml:space="preserve">FR-05 (Symptom Checker): </w:t>
-      </w:r>
-      <w:r>
-        <w:rPr>
-          <w:rFonts w:ascii="Calibri" w:cs="Calibri" w:eastAsia="Calibri" w:hAnsi="Calibri"/>
-          <w:sz w:val="22"/>
-          <w:szCs w:val="22"/>
-        </w:rPr>
-        <w:t xml:space="preserve">Multi-symptom triage matrix calculates overall urgency (HIGH, MEDIUM, LOW) and matches corresponding specialists.</w:t>
+        <w:t xml:space="preserve">FR-01 (Authentication): </w:t>
+      </w:r>
+      <w:r>
+        <w:rPr>
+          <w:rFonts w:ascii="Calibri" w:cs="Calibri" w:eastAsia="Calibri" w:hAnsi="Calibri"/>
+          <w:sz w:val="22"/>
+          <w:szCs w:val="22"/>
+        </w:rPr>
+        <w:t xml:space="preserve">System shall authenticate users using JWT with bcrypt password salting.</w:t>
       </w:r>
     </w:p>
     <w:p>
@@ -429,15 +451,15 @@
           <w:sz w:val="22"/>
           <w:szCs w:val="22"/>
         </w:rPr>
-        <w:t xml:space="preserve">FR-06 (Prescription Records): </w:t>
-      </w:r>
-      <w:r>
-        <w:rPr>
-          <w:rFonts w:ascii="Calibri" w:cs="Calibri" w:eastAsia="Calibri" w:hAnsi="Calibri"/>
-          <w:sz w:val="22"/>
-          <w:szCs w:val="22"/>
-        </w:rPr>
-        <w:t xml:space="preserve">Doctors can mark consultations as completed, recording clinical diagnosis and prescriptions.</w:t>
+        <w:t xml:space="preserve">FR-02 (Authorization): </w:t>
+      </w:r>
+      <w:r>
+        <w:rPr>
+          <w:rFonts w:ascii="Calibri" w:cs="Calibri" w:eastAsia="Calibri" w:hAnsi="Calibri"/>
+          <w:sz w:val="22"/>
+          <w:szCs w:val="22"/>
+        </w:rPr>
+        <w:t xml:space="preserve">System shall enforce strict Role-Based Access Control (RBAC), returning 403 Forbidden for unauthorized endpoints.</w:t>
       </w:r>
     </w:p>
     <w:p>
@@ -457,6 +479,118 @@
           <w:sz w:val="22"/>
           <w:szCs w:val="22"/>
         </w:rPr>
+        <w:t xml:space="preserve">FR-03 (Doctor Directory): </w:t>
+      </w:r>
+      <w:r>
+        <w:rPr>
+          <w:rFonts w:ascii="Calibri" w:cs="Calibri" w:eastAsia="Calibri" w:hAnsi="Calibri"/>
+          <w:sz w:val="22"/>
+          <w:szCs w:val="22"/>
+        </w:rPr>
+        <w:t xml:space="preserve">Patients can search and filter 24+ doctors by 18 departments, name, experience, and consultation fees.</w:t>
+      </w:r>
+    </w:p>
+    <w:p>
+      <w:pPr>
+        <w:pStyle w:val="ListParagraph"/>
+        <w:numPr>
+          <w:ilvl w:val="0"/>
+          <w:numId w:val="1"/>
+        </w:numPr>
+        <w:spacing w:after="60"/>
+      </w:pPr>
+      <w:r>
+        <w:rPr>
+          <w:rFonts w:ascii="Calibri" w:cs="Calibri" w:eastAsia="Calibri" w:hAnsi="Calibri"/>
+          <w:b/>
+          <w:bCs/>
+          <w:sz w:val="22"/>
+          <w:szCs w:val="22"/>
+        </w:rPr>
+        <w:t xml:space="preserve">FR-04 (Slot Booking): </w:t>
+      </w:r>
+      <w:r>
+        <w:rPr>
+          <w:rFonts w:ascii="Calibri" w:cs="Calibri" w:eastAsia="Calibri" w:hAnsi="Calibri"/>
+          <w:sz w:val="22"/>
+          <w:szCs w:val="22"/>
+        </w:rPr>
+        <w:t xml:space="preserve">Patients can book unreserved 30-minute consultation slots with atomic reservation checks to prevent double-booking.</w:t>
+      </w:r>
+    </w:p>
+    <w:p>
+      <w:pPr>
+        <w:pStyle w:val="ListParagraph"/>
+        <w:numPr>
+          <w:ilvl w:val="0"/>
+          <w:numId w:val="1"/>
+        </w:numPr>
+        <w:spacing w:after="60"/>
+      </w:pPr>
+      <w:r>
+        <w:rPr>
+          <w:rFonts w:ascii="Calibri" w:cs="Calibri" w:eastAsia="Calibri" w:hAnsi="Calibri"/>
+          <w:b/>
+          <w:bCs/>
+          <w:sz w:val="22"/>
+          <w:szCs w:val="22"/>
+        </w:rPr>
+        <w:t xml:space="preserve">FR-05 (Symptom Checker): </w:t>
+      </w:r>
+      <w:r>
+        <w:rPr>
+          <w:rFonts w:ascii="Calibri" w:cs="Calibri" w:eastAsia="Calibri" w:hAnsi="Calibri"/>
+          <w:sz w:val="22"/>
+          <w:szCs w:val="22"/>
+        </w:rPr>
+        <w:t xml:space="preserve">Multi-symptom triage matrix (22+ clinical symptoms) calculates overall urgency (HIGH, MEDIUM, LOW) and matches corresponding specialists.</w:t>
+      </w:r>
+    </w:p>
+    <w:p>
+      <w:pPr>
+        <w:pStyle w:val="ListParagraph"/>
+        <w:numPr>
+          <w:ilvl w:val="0"/>
+          <w:numId w:val="1"/>
+        </w:numPr>
+        <w:spacing w:after="60"/>
+      </w:pPr>
+      <w:r>
+        <w:rPr>
+          <w:rFonts w:ascii="Calibri" w:cs="Calibri" w:eastAsia="Calibri" w:hAnsi="Calibri"/>
+          <w:b/>
+          <w:bCs/>
+          <w:sz w:val="22"/>
+          <w:szCs w:val="22"/>
+        </w:rPr>
+        <w:t xml:space="preserve">FR-06 (Prescription Records): </w:t>
+      </w:r>
+      <w:r>
+        <w:rPr>
+          <w:rFonts w:ascii="Calibri" w:cs="Calibri" w:eastAsia="Calibri" w:hAnsi="Calibri"/>
+          <w:sz w:val="22"/>
+          <w:szCs w:val="22"/>
+        </w:rPr>
+        <w:t xml:space="preserve">Doctors can mark consultations as completed, recording clinical diagnosis and prescriptions.</w:t>
+      </w:r>
+    </w:p>
+    <w:p>
+      <w:pPr>
+        <w:pStyle w:val="ListParagraph"/>
+        <w:numPr>
+          <w:ilvl w:val="0"/>
+          <w:numId w:val="1"/>
+        </w:numPr>
+        <w:spacing w:after="60"/>
+      </w:pPr>
+      <w:r>
+        <w:rPr>
+          <w:rFonts w:ascii="Calibri" w:cs="Calibri" w:eastAsia="Calibri" w:hAnsi="Calibri"/>
+          <w:b/>
+          <w:bCs/>
+          <w:sz w:val="22"/>
+          <w:szCs w:val="22"/>
+        </w:rPr>
         <w:t xml:space="preserve">FR-07 (Admin Analytics): </w:t>
       </w:r>
       <w:r>
@@ -474,7 +608,7 @@
         <w:spacing w:after="120" w:before="240"/>
       </w:pPr>
       <w:r>
-        <w:t xml:space="preserve">4. Verification &amp; Test Matrix</w:t>
+        <w:t xml:space="preserve">5. Verification &amp; Test Matrix</w:t>
       </w:r>
     </w:p>
     <w:tbl>
@@ -985,6 +1119,104 @@
           </w:p>
         </w:tc>
       </w:tr>
+      <w:tr>
+        <w:tc>
+          <w:tcPr>
+            <w:shd w:fill="F8FAFC" w:val="clear"/>
+            <w:tcMar>
+              <w:top w:type="dxa" w:w="100"/>
+              <w:left w:type="dxa" w:w="120"/>
+              <w:bottom w:type="dxa" w:w="100"/>
+              <w:right w:type="dxa" w:w="120"/>
+            </w:tcMar>
+          </w:tcPr>
+          <w:p>
+            <w:r>
+              <w:rPr>
+                <w:rFonts w:ascii="Calibri" w:cs="Calibri" w:eastAsia="Calibri" w:hAnsi="Calibri"/>
+                <w:b w:val="false"/>
+                <w:bCs w:val="false"/>
+                <w:color w:val="000000"/>
+                <w:sz w:val="20"/>
+                <w:szCs w:val="20"/>
+              </w:rPr>
+              <w:t xml:space="preserve">TC-05</w:t>
+            </w:r>
+          </w:p>
+        </w:tc>
+        <w:tc>
+          <w:tcPr>
+            <w:shd w:fill="F8FAFC" w:val="clear"/>
+            <w:tcMar>
+              <w:top w:type="dxa" w:w="100"/>
+              <w:left w:type="dxa" w:w="120"/>
+              <w:bottom w:type="dxa" w:w="100"/>
+              <w:right w:type="dxa" w:w="120"/>
+            </w:tcMar>
+          </w:tcPr>
+          <w:p>
+            <w:r>
+              <w:rPr>
+                <w:rFonts w:ascii="Calibri" w:cs="Calibri" w:eastAsia="Calibri" w:hAnsi="Calibri"/>
+                <w:b w:val="false"/>
+                <w:bCs w:val="false"/>
+                <w:color w:val="000000"/>
+                <w:sz w:val="20"/>
+                <w:szCs w:val="20"/>
+              </w:rPr>
+              <w:t xml:space="preserve">Multi-Department Filtering</w:t>
+            </w:r>
+          </w:p>
+        </w:tc>
+        <w:tc>
+          <w:tcPr>
+            <w:shd w:fill="F8FAFC" w:val="clear"/>
+            <w:tcMar>
+              <w:top w:type="dxa" w:w="100"/>
+              <w:left w:type="dxa" w:w="120"/>
+              <w:bottom w:type="dxa" w:w="100"/>
+              <w:right w:type="dxa" w:w="120"/>
+            </w:tcMar>
+          </w:tcPr>
+          <w:p>
+            <w:r>
+              <w:rPr>
+                <w:rFonts w:ascii="Calibri" w:cs="Calibri" w:eastAsia="Calibri" w:hAnsi="Calibri"/>
+                <w:b w:val="false"/>
+                <w:bCs w:val="false"/>
+                <w:color w:val="000000"/>
+                <w:sz w:val="20"/>
+                <w:szCs w:val="20"/>
+              </w:rPr>
+              <w:t xml:space="preserve">Correctly filters doctors across all 18 clinical departments</w:t>
+            </w:r>
+          </w:p>
+        </w:tc>
+        <w:tc>
+          <w:tcPr>
+            <w:shd w:fill="F8FAFC" w:val="clear"/>
+            <w:tcMar>
+              <w:top w:type="dxa" w:w="100"/>
+              <w:left w:type="dxa" w:w="120"/>
+              <w:bottom w:type="dxa" w:w="100"/>
+              <w:right w:type="dxa" w:w="120"/>
+            </w:tcMar>
+          </w:tcPr>
+          <w:p>
+            <w:r>
+              <w:rPr>
+                <w:rFonts w:ascii="Calibri" w:cs="Calibri" w:eastAsia="Calibri" w:hAnsi="Calibri"/>
+                <w:b w:val="false"/>
+                <w:bCs w:val="false"/>
+                <w:color w:val="000000"/>
+                <w:sz w:val="20"/>
+                <w:szCs w:val="20"/>
+              </w:rPr>
+              <w:t xml:space="preserve">PASSED</w:t>
+            </w:r>
+          </w:p>
+        </w:tc>
+      </w:tr>
     </w:tbl>
     <w:p>
       <w:pPr>
@@ -992,7 +1224,7 @@
         <w:spacing w:after="120" w:before="240"/>
       </w:pPr>
       <w:r>
-        <w:t xml:space="preserve">5. Non-Functional Requirements</w:t>
+        <w:t xml:space="preserve">6. Non-Functional Requirements</w:t>
       </w:r>
     </w:p>
     <w:p>
@@ -1012,15 +1244,15 @@
           <w:sz w:val="22"/>
           <w:szCs w:val="22"/>
         </w:rPr>
-        <w:t xml:space="preserve">5.1 Performance: </w:t>
-      </w:r>
-      <w:r>
-        <w:rPr>
-          <w:rFonts w:ascii="Calibri" w:cs="Calibri" w:eastAsia="Calibri" w:hAnsi="Calibri"/>
-          <w:sz w:val="22"/>
-          <w:szCs w:val="22"/>
-        </w:rPr>
-        <w:t xml:space="preserve">Average API response time under 300ms for all standard queries.</w:t>
+        <w:t xml:space="preserve">6.1 Performance: </w:t>
+      </w:r>
+      <w:r>
+        <w:rPr>
+          <w:rFonts w:ascii="Calibri" w:cs="Calibri" w:eastAsia="Calibri" w:hAnsi="Calibri"/>
+          <w:sz w:val="22"/>
+          <w:szCs w:val="22"/>
+        </w:rPr>
+        <w:t xml:space="preserve">Average API response time under 300ms for all standard queries across 24 doctor profiles.</w:t>
       </w:r>
     </w:p>
     <w:p>
@@ -1040,7 +1272,7 @@
           <w:sz w:val="22"/>
           <w:szCs w:val="22"/>
         </w:rPr>
-        <w:t xml:space="preserve">5.2 Security: </w:t>
+        <w:t xml:space="preserve">6.2 Security: </w:t>
       </w:r>
       <w:r>
         <w:rPr>
@@ -1068,7 +1300,7 @@
           <w:sz w:val="22"/>
           <w:szCs w:val="22"/>
         </w:rPr>
-        <w:t xml:space="preserve">5.3 Safety: </w:t>
+        <w:t xml:space="preserve">6.3 Safety: </w:t>
       </w:r>
       <w:r>
         <w:rPr>

</xml_diff>